<commit_message>
Restructure Word manuscript and credit Vusumuzi Mabasa
</commit_message>
<xml_diff>
--- a/report/reference.docx
+++ b/report/reference.docx
@@ -384,7 +384,7 @@
     <w:qFormat/>
     <w:rsid w:val="00FC693F"/>
     <w:pPr>
-      <w:spacing w:after="140"/>
+      <w:spacing w:after="100"/>
     </w:pPr>
     <w:rPr>
       <w:rFonts w:ascii="Calibri" w:hAnsi="Calibri"/>
@@ -820,7 +820,7 @@
     <w:unhideWhenUsed/>
     <w:rsid w:val="00AA1D8D"/>
     <w:pPr>
-      <w:spacing w:after="140"/>
+      <w:spacing w:after="100"/>
     </w:pPr>
     <w:rPr>
       <w:rFonts w:ascii="Calibri" w:hAnsi="Calibri"/>

</xml_diff>